<commit_message>
Add SK4 L4 2-cycle calculator labs and ignore .claude folder
Co-Authored-By: Claude Sonnet 5 <noreply@anthropic.com>
</commit_message>
<xml_diff>
--- a/Day_3_4_5/docs/RV_D3SK3_L3_Lab_On_Error_Conditions_Within_Computation_Pipeline.docx
+++ b/Day_3_4_5/docs/RV_D3SK3_L3_Lab_On_Error_Conditions_Within_Computation_Pipeline.docx
@@ -196,6 +196,9 @@
         <w:spacing w:after="120"/>
       </w:pPr>
       <w:r>
+        <w:rPr>
+          <w:noProof/>
+        </w:rPr>
         <w:drawing>
           <wp:inline distT="0" distB="0" distL="0" distR="0" wp14:anchorId="0F8F23BB" wp14:editId="594EBDD6">
             <wp:extent cx="4792980" cy="2470833"/>
@@ -261,6 +264,9 @@
         <w:spacing w:after="120"/>
       </w:pPr>
       <w:r>
+        <w:rPr>
+          <w:noProof/>
+        </w:rPr>
         <w:drawing>
           <wp:inline distT="0" distB="0" distL="0" distR="0" wp14:anchorId="2E84DD54" wp14:editId="043FC0A3">
             <wp:extent cx="4583430" cy="3327220"/>
@@ -322,6 +328,9 @@
         <w:pStyle w:val="Heading1"/>
       </w:pPr>
       <w:r>
+        <w:rPr>
+          <w:noProof/>
+        </w:rPr>
         <w:drawing>
           <wp:inline distT="0" distB="0" distL="0" distR="0" wp14:anchorId="15576CB2" wp14:editId="69D9147F">
             <wp:extent cx="5731510" cy="3220085"/>
@@ -510,12 +519,6 @@
         <w:gridCol w:w="5326"/>
       </w:tblGrid>
       <w:tr>
-        <w:tblPrEx>
-          <w:tblCellMar>
-            <w:top w:w="0" w:type="dxa"/>
-            <w:bottom w:w="0" w:type="dxa"/>
-          </w:tblCellMar>
-        </w:tblPrEx>
         <w:trPr>
           <w:tblHeader/>
         </w:trPr>
@@ -602,12 +605,6 @@
         </w:tc>
       </w:tr>
       <w:tr>
-        <w:tblPrEx>
-          <w:tblCellMar>
-            <w:top w:w="0" w:type="dxa"/>
-            <w:bottom w:w="0" w:type="dxa"/>
-          </w:tblCellMar>
-        </w:tblPrEx>
         <w:tc>
           <w:tcPr>
             <w:tcW w:w="1000" w:type="dxa"/>
@@ -747,12 +744,6 @@
         </w:tc>
       </w:tr>
       <w:tr>
-        <w:tblPrEx>
-          <w:tblCellMar>
-            <w:top w:w="0" w:type="dxa"/>
-            <w:bottom w:w="0" w:type="dxa"/>
-          </w:tblCellMar>
-        </w:tblPrEx>
         <w:tc>
           <w:tcPr>
             <w:tcW w:w="1000" w:type="dxa"/>
@@ -836,12 +827,6 @@
         </w:tc>
       </w:tr>
       <w:tr>
-        <w:tblPrEx>
-          <w:tblCellMar>
-            <w:top w:w="0" w:type="dxa"/>
-            <w:bottom w:w="0" w:type="dxa"/>
-          </w:tblCellMar>
-        </w:tblPrEx>
         <w:tc>
           <w:tcPr>
             <w:tcW w:w="1000" w:type="dxa"/>
@@ -945,12 +930,6 @@
         </w:tc>
       </w:tr>
       <w:tr>
-        <w:tblPrEx>
-          <w:tblCellMar>
-            <w:top w:w="0" w:type="dxa"/>
-            <w:bottom w:w="0" w:type="dxa"/>
-          </w:tblCellMar>
-        </w:tblPrEx>
         <w:tc>
           <w:tcPr>
             <w:tcW w:w="1000" w:type="dxa"/>
@@ -1034,12 +1013,6 @@
         </w:tc>
       </w:tr>
       <w:tr>
-        <w:tblPrEx>
-          <w:tblCellMar>
-            <w:top w:w="0" w:type="dxa"/>
-            <w:bottom w:w="0" w:type="dxa"/>
-          </w:tblCellMar>
-        </w:tblPrEx>
         <w:tc>
           <w:tcPr>
             <w:tcW w:w="1000" w:type="dxa"/>
@@ -2292,12 +2265,6 @@
         <w:gridCol w:w="3826"/>
       </w:tblGrid>
       <w:tr>
-        <w:tblPrEx>
-          <w:tblCellMar>
-            <w:top w:w="0" w:type="dxa"/>
-            <w:bottom w:w="0" w:type="dxa"/>
-          </w:tblCellMar>
-        </w:tblPrEx>
         <w:trPr>
           <w:tblHeader/>
         </w:trPr>
@@ -2411,12 +2378,6 @@
         </w:tc>
       </w:tr>
       <w:tr>
-        <w:tblPrEx>
-          <w:tblCellMar>
-            <w:top w:w="0" w:type="dxa"/>
-            <w:bottom w:w="0" w:type="dxa"/>
-          </w:tblCellMar>
-        </w:tblPrEx>
         <w:tc>
           <w:tcPr>
             <w:tcW w:w="2200" w:type="dxa"/>
@@ -2512,12 +2473,6 @@
         </w:tc>
       </w:tr>
       <w:tr>
-        <w:tblPrEx>
-          <w:tblCellMar>
-            <w:top w:w="0" w:type="dxa"/>
-            <w:bottom w:w="0" w:type="dxa"/>
-          </w:tblCellMar>
-        </w:tblPrEx>
         <w:tc>
           <w:tcPr>
             <w:tcW w:w="2200" w:type="dxa"/>
@@ -2613,12 +2568,6 @@
         </w:tc>
       </w:tr>
       <w:tr>
-        <w:tblPrEx>
-          <w:tblCellMar>
-            <w:top w:w="0" w:type="dxa"/>
-            <w:bottom w:w="0" w:type="dxa"/>
-          </w:tblCellMar>
-        </w:tblPrEx>
         <w:tc>
           <w:tcPr>
             <w:tcW w:w="2200" w:type="dxa"/>
@@ -2978,12 +2927,6 @@
         <w:gridCol w:w="3026"/>
       </w:tblGrid>
       <w:tr>
-        <w:tblPrEx>
-          <w:tblCellMar>
-            <w:top w:w="0" w:type="dxa"/>
-            <w:bottom w:w="0" w:type="dxa"/>
-          </w:tblCellMar>
-        </w:tblPrEx>
         <w:trPr>
           <w:tblHeader/>
         </w:trPr>
@@ -3160,12 +3103,6 @@
         </w:tc>
       </w:tr>
       <w:tr>
-        <w:tblPrEx>
-          <w:tblCellMar>
-            <w:top w:w="0" w:type="dxa"/>
-            <w:bottom w:w="0" w:type="dxa"/>
-          </w:tblCellMar>
-        </w:tblPrEx>
         <w:tc>
           <w:tcPr>
             <w:tcW w:w="1500" w:type="dxa"/>
@@ -3303,12 +3240,6 @@
         </w:tc>
       </w:tr>
       <w:tr>
-        <w:tblPrEx>
-          <w:tblCellMar>
-            <w:top w:w="0" w:type="dxa"/>
-            <w:bottom w:w="0" w:type="dxa"/>
-          </w:tblCellMar>
-        </w:tblPrEx>
         <w:tc>
           <w:tcPr>
             <w:tcW w:w="1500" w:type="dxa"/>
@@ -3446,12 +3377,6 @@
         </w:tc>
       </w:tr>
       <w:tr>
-        <w:tblPrEx>
-          <w:tblCellMar>
-            <w:top w:w="0" w:type="dxa"/>
-            <w:bottom w:w="0" w:type="dxa"/>
-          </w:tblCellMar>
-        </w:tblPrEx>
         <w:tc>
           <w:tcPr>
             <w:tcW w:w="1500" w:type="dxa"/>
@@ -3589,12 +3514,6 @@
         </w:tc>
       </w:tr>
       <w:tr>
-        <w:tblPrEx>
-          <w:tblCellMar>
-            <w:top w:w="0" w:type="dxa"/>
-            <w:bottom w:w="0" w:type="dxa"/>
-          </w:tblCellMar>
-        </w:tblPrEx>
         <w:tc>
           <w:tcPr>
             <w:tcW w:w="1500" w:type="dxa"/>
@@ -3732,12 +3651,6 @@
         </w:tc>
       </w:tr>
       <w:tr>
-        <w:tblPrEx>
-          <w:tblCellMar>
-            <w:top w:w="0" w:type="dxa"/>
-            <w:bottom w:w="0" w:type="dxa"/>
-          </w:tblCellMar>
-        </w:tblPrEx>
         <w:tc>
           <w:tcPr>
             <w:tcW w:w="1500" w:type="dxa"/>
@@ -3875,12 +3788,6 @@
         </w:tc>
       </w:tr>
       <w:tr>
-        <w:tblPrEx>
-          <w:tblCellMar>
-            <w:top w:w="0" w:type="dxa"/>
-            <w:bottom w:w="0" w:type="dxa"/>
-          </w:tblCellMar>
-        </w:tblPrEx>
         <w:tc>
           <w:tcPr>
             <w:tcW w:w="1500" w:type="dxa"/>
@@ -4037,70 +3944,6 @@
       <w:proofErr w:type="spellEnd"/>
       <w:r>
         <w:t xml:space="preserve"> look at one transaction at a time and check that $err3 at @6 equals the OR of the four conditions from the appropriate stages.</w:t>
-      </w:r>
-    </w:p>
-    <w:p>
-      <w:pPr>
-        <w:pStyle w:val="Heading1"/>
-      </w:pPr>
-      <w:r>
-        <w:t>6. Notes</w:t>
-      </w:r>
-    </w:p>
-    <w:p>
-      <w:pPr>
-        <w:pStyle w:val="ListParagraph"/>
-        <w:numPr>
-          <w:ilvl w:val="0"/>
-          <w:numId w:val="2"/>
-        </w:numPr>
-        <w:spacing w:after="80"/>
-      </w:pPr>
-      <w:r>
-        <w:t xml:space="preserve">The reference code in the screenshot names the pipeline </w:t>
-      </w:r>
-      <w:r>
-        <w:rPr>
-          <w:rFonts w:ascii="Consolas" w:eastAsia="Consolas" w:hAnsi="Consolas" w:cs="Consolas"/>
-          <w:sz w:val="20"/>
-          <w:szCs w:val="20"/>
-        </w:rPr>
-        <w:t>|pipeline</w:t>
-      </w:r>
-      <w:r>
-        <w:t xml:space="preserve">, while the lab diagram calls it </w:t>
-      </w:r>
-      <w:r>
-        <w:rPr>
-          <w:rFonts w:ascii="Consolas" w:eastAsia="Consolas" w:hAnsi="Consolas" w:cs="Consolas"/>
-          <w:sz w:val="20"/>
-          <w:szCs w:val="20"/>
-        </w:rPr>
-        <w:t>|comp</w:t>
-      </w:r>
-      <w:r>
-        <w:t>. I followed the diagram. Renaming it is a one-word change.</w:t>
-      </w:r>
-    </w:p>
-    <w:p>
-      <w:pPr>
-        <w:pStyle w:val="ListParagraph"/>
-        <w:numPr>
-          <w:ilvl w:val="0"/>
-          <w:numId w:val="2"/>
-        </w:numPr>
-        <w:spacing w:after="80"/>
-      </w:pPr>
-      <w:r>
-        <w:t xml:space="preserve">I have not run this in </w:t>
-      </w:r>
-      <w:proofErr w:type="spellStart"/>
-      <w:r>
-        <w:t>Makerchip</w:t>
-      </w:r>
-      <w:proofErr w:type="spellEnd"/>
-      <w:r>
-        <w:t>. When you do, check the Nav-TLV pane for warnings and confirm that the $rand_* stimulus signals appear in the waveform.</w:t>
       </w:r>
     </w:p>
     <w:sectPr>
@@ -4853,6 +4696,7 @@
   <w:style w:type="character" w:default="1" w:styleId="DefaultParagraphFont">
     <w:name w:val="Default Paragraph Font"/>
     <w:uiPriority w:val="1"/>
+    <w:semiHidden/>
     <w:unhideWhenUsed/>
   </w:style>
   <w:style w:type="table" w:default="1" w:styleId="TableNormal">

</xml_diff>

<commit_message>
Add D4 SK3 register file and branch labs; rename problem statements to Lab_Scope
Add the register-file sum 1-to-9 lab and the branch instruction
implementation lab with test bench. Rename Problem_Statement images to
Lab_Scope, fix the Singele typo in the single-value memory lab files,
and refresh the existing docs.

Co-Authored-By: Claude Sonnet 5 <noreply@anthropic.com>
</commit_message>
<xml_diff>
--- a/Day_3_4_5/docs/RV_D3SK3_L3_Lab_On_Error_Conditions_Within_Computation_Pipeline.docx
+++ b/Day_3_4_5/docs/RV_D3SK3_L3_Lab_On_Error_Conditions_Within_Computation_Pipeline.docx
@@ -177,7 +177,7 @@
           <w:b/>
           <w:bCs/>
         </w:rPr>
-        <w:t>.tlv</w:t>
+        <w:t>.v</w:t>
       </w:r>
       <w:r>
         <w:t>, a solution to the "Lab: Pipeline" problem. Error conditions are detected at different stages of a computation pipeline, and the design combines them into a single final error signal using OR-gate aggregation.</w:t>
@@ -262,15 +262,39 @@
     <w:p>
       <w:pPr>
         <w:spacing w:after="120"/>
-      </w:pPr>
-      <w:r>
         <w:rPr>
           <w:noProof/>
         </w:rPr>
+      </w:pPr>
+      <w:r>
+        <w:rPr>
+          <w:noProof/>
+          <w:sz w:val="24"/>
+          <w:szCs w:val="24"/>
+        </w:rPr>
+        <w:t xml:space="preserve">MakerChip URL: </w:t>
+      </w:r>
+      <w:hyperlink r:id="rId8" w:history="1">
+        <w:r>
+          <w:rPr>
+            <w:rStyle w:val="Hyperlink"/>
+          </w:rPr>
+          <w:t>https://www.makerchip.com/v186/ide/~0o2fLcpK/p-0ylcNP</w:t>
+        </w:r>
+      </w:hyperlink>
+    </w:p>
+    <w:p>
+      <w:pPr>
+        <w:spacing w:after="120"/>
+      </w:pPr>
+      <w:r>
+        <w:rPr>
+          <w:noProof/>
+        </w:rPr>
         <w:drawing>
-          <wp:inline distT="0" distB="0" distL="0" distR="0" wp14:anchorId="2E84DD54" wp14:editId="043FC0A3">
-            <wp:extent cx="4583430" cy="3327220"/>
-            <wp:effectExtent l="19050" t="19050" r="26670" b="26035"/>
+          <wp:inline distT="0" distB="0" distL="0" distR="0" wp14:anchorId="2E84DD54" wp14:editId="1BFF334C">
+            <wp:extent cx="4812030" cy="3138805"/>
+            <wp:effectExtent l="19050" t="19050" r="26670" b="23495"/>
             <wp:docPr id="1141030822" name="Picture 1"/>
             <wp:cNvGraphicFramePr>
               <a:graphicFrameLocks xmlns:a="http://schemas.openxmlformats.org/drawingml/2006/main" noChangeAspect="1"/>
@@ -283,7 +307,7 @@
                     <pic:cNvPicPr/>
                   </pic:nvPicPr>
                   <pic:blipFill>
-                    <a:blip r:embed="rId8"/>
+                    <a:blip r:embed="rId9"/>
                     <a:stretch>
                       <a:fillRect/>
                     </a:stretch>
@@ -291,7 +315,7 @@
                   <pic:spPr>
                     <a:xfrm>
                       <a:off x="0" y="0"/>
-                      <a:ext cx="4612806" cy="3348545"/>
+                      <a:ext cx="4846879" cy="3161536"/>
                     </a:xfrm>
                     <a:prstGeom prst="rect">
                       <a:avLst/>
@@ -349,7 +373,7 @@
                     </pic:cNvPicPr>
                   </pic:nvPicPr>
                   <pic:blipFill>
-                    <a:blip r:embed="rId9" cstate="print">
+                    <a:blip r:embed="rId10" cstate="print">
                       <a:extLst>
                         <a:ext uri="{28A0092B-C50C-407E-A947-70E740481C1C}">
                           <a14:useLocalDpi xmlns:a14="http://schemas.microsoft.com/office/drawing/2010/main" val="0"/>
@@ -387,11 +411,6 @@
       <w:pPr>
         <w:pStyle w:val="Heading1"/>
       </w:pPr>
-    </w:p>
-    <w:p>
-      <w:pPr>
-        <w:pStyle w:val="Heading1"/>
-      </w:pPr>
       <w:proofErr w:type="spellStart"/>
       <w:r>
         <w:t>Makerchip</w:t>
@@ -427,7 +446,7 @@
                     </pic:cNvPicPr>
                   </pic:nvPicPr>
                   <pic:blipFill>
-                    <a:blip r:embed="rId10" cstate="print">
+                    <a:blip r:embed="rId11" cstate="print">
                       <a:extLst>
                         <a:ext uri="{28A0092B-C50C-407E-A947-70E740481C1C}">
                           <a14:useLocalDpi xmlns:a14="http://schemas.microsoft.com/office/drawing/2010/main" val="0"/>
@@ -475,6 +494,11 @@
       <w:pPr>
         <w:pStyle w:val="Heading1"/>
       </w:pPr>
+    </w:p>
+    <w:p>
+      <w:pPr>
+        <w:pStyle w:val="Heading1"/>
+      </w:pPr>
       <w:r>
         <w:lastRenderedPageBreak/>
         <w:t>Implementation Elaboration</w:t>
@@ -1269,25 +1293,7 @@
           <w:sz w:val="18"/>
           <w:szCs w:val="18"/>
         </w:rPr>
-        <w:t xml:space="preserve">         // aggregation is visible in simulation. Qualified </w:t>
-      </w:r>
-      <w:proofErr w:type="gramStart"/>
-      <w:r>
-        <w:rPr>
-          <w:rFonts w:ascii="Consolas" w:eastAsia="Consolas" w:hAnsi="Consolas" w:cs="Consolas"/>
-          <w:sz w:val="18"/>
-          <w:szCs w:val="18"/>
-        </w:rPr>
-        <w:t>by !</w:t>
-      </w:r>
-      <w:proofErr w:type="gramEnd"/>
-      <w:r>
-        <w:rPr>
-          <w:rFonts w:ascii="Consolas" w:eastAsia="Consolas" w:hAnsi="Consolas" w:cs="Consolas"/>
-          <w:sz w:val="18"/>
-          <w:szCs w:val="18"/>
-        </w:rPr>
-        <w:t>$reset so that</w:t>
+        <w:t xml:space="preserve">         // aggregation is visible in simulation. Qualified by !$reset so that</w:t>
       </w:r>
     </w:p>
     <w:p>
@@ -1324,16 +1330,7 @@
           <w:sz w:val="18"/>
           <w:szCs w:val="18"/>
         </w:rPr>
-        <w:t>bad_</w:t>
-      </w:r>
-      <w:proofErr w:type="gramStart"/>
-      <w:r>
-        <w:rPr>
-          <w:rFonts w:ascii="Consolas" w:eastAsia="Consolas" w:hAnsi="Consolas" w:cs="Consolas"/>
-          <w:sz w:val="18"/>
-          <w:szCs w:val="18"/>
-        </w:rPr>
-        <w:t>input</w:t>
+        <w:t>bad_input</w:t>
       </w:r>
       <w:proofErr w:type="spellEnd"/>
       <w:r>
@@ -1342,16 +1339,7 @@
           <w:sz w:val="18"/>
           <w:szCs w:val="18"/>
         </w:rPr>
-        <w:t xml:space="preserve">  =</w:t>
-      </w:r>
-      <w:proofErr w:type="gramEnd"/>
-      <w:r>
-        <w:rPr>
-          <w:rFonts w:ascii="Consolas" w:eastAsia="Consolas" w:hAnsi="Consolas" w:cs="Consolas"/>
-          <w:sz w:val="18"/>
-          <w:szCs w:val="18"/>
-        </w:rPr>
-        <w:t xml:space="preserve"> ! $reset &amp;&amp; ($</w:t>
+        <w:t xml:space="preserve">  = ! $reset &amp;&amp; ($</w:t>
       </w:r>
       <w:proofErr w:type="spellStart"/>
       <w:r>
@@ -1360,16 +1348,7 @@
           <w:sz w:val="18"/>
           <w:szCs w:val="18"/>
         </w:rPr>
-        <w:t>rand_bad_</w:t>
-      </w:r>
-      <w:proofErr w:type="gramStart"/>
-      <w:r>
-        <w:rPr>
-          <w:rFonts w:ascii="Consolas" w:eastAsia="Consolas" w:hAnsi="Consolas" w:cs="Consolas"/>
-          <w:sz w:val="18"/>
-          <w:szCs w:val="18"/>
-        </w:rPr>
-        <w:t>input</w:t>
+        <w:t>rand_bad_input</w:t>
       </w:r>
       <w:proofErr w:type="spellEnd"/>
       <w:r>
@@ -1378,34 +1357,7 @@
           <w:sz w:val="18"/>
           <w:szCs w:val="18"/>
         </w:rPr>
-        <w:t>[</w:t>
-      </w:r>
-      <w:proofErr w:type="gramEnd"/>
-      <w:r>
-        <w:rPr>
-          <w:rFonts w:ascii="Consolas" w:eastAsia="Consolas" w:hAnsi="Consolas" w:cs="Consolas"/>
-          <w:sz w:val="18"/>
-          <w:szCs w:val="18"/>
-        </w:rPr>
-        <w:t>2:0</w:t>
-      </w:r>
-      <w:proofErr w:type="gramStart"/>
-      <w:r>
-        <w:rPr>
-          <w:rFonts w:ascii="Consolas" w:eastAsia="Consolas" w:hAnsi="Consolas" w:cs="Consolas"/>
-          <w:sz w:val="18"/>
-          <w:szCs w:val="18"/>
-        </w:rPr>
-        <w:t>]  =</w:t>
-      </w:r>
-      <w:proofErr w:type="gramEnd"/>
-      <w:r>
-        <w:rPr>
-          <w:rFonts w:ascii="Consolas" w:eastAsia="Consolas" w:hAnsi="Consolas" w:cs="Consolas"/>
-          <w:sz w:val="18"/>
-          <w:szCs w:val="18"/>
-        </w:rPr>
-        <w:t>= 3'd0);</w:t>
+        <w:t>[2:0]  == 3'd0);</w:t>
       </w:r>
     </w:p>
     <w:p>
@@ -1437,25 +1389,7 @@
           <w:sz w:val="18"/>
           <w:szCs w:val="18"/>
         </w:rPr>
-        <w:t xml:space="preserve"> </w:t>
-      </w:r>
-      <w:proofErr w:type="gramStart"/>
-      <w:r>
-        <w:rPr>
-          <w:rFonts w:ascii="Consolas" w:eastAsia="Consolas" w:hAnsi="Consolas" w:cs="Consolas"/>
-          <w:sz w:val="18"/>
-          <w:szCs w:val="18"/>
-        </w:rPr>
-        <w:t>= !</w:t>
-      </w:r>
-      <w:proofErr w:type="gramEnd"/>
-      <w:r>
-        <w:rPr>
-          <w:rFonts w:ascii="Consolas" w:eastAsia="Consolas" w:hAnsi="Consolas" w:cs="Consolas"/>
-          <w:sz w:val="18"/>
-          <w:szCs w:val="18"/>
-        </w:rPr>
-        <w:t xml:space="preserve"> $reset &amp;&amp; ($</w:t>
+        <w:t xml:space="preserve"> = ! $reset &amp;&amp; ($</w:t>
       </w:r>
       <w:proofErr w:type="spellStart"/>
       <w:r>
@@ -1464,16 +1398,7 @@
           <w:sz w:val="18"/>
           <w:szCs w:val="18"/>
         </w:rPr>
-        <w:t>rand_illegal_</w:t>
-      </w:r>
-      <w:proofErr w:type="gramStart"/>
-      <w:r>
-        <w:rPr>
-          <w:rFonts w:ascii="Consolas" w:eastAsia="Consolas" w:hAnsi="Consolas" w:cs="Consolas"/>
-          <w:sz w:val="18"/>
-          <w:szCs w:val="18"/>
-        </w:rPr>
-        <w:t>op</w:t>
+        <w:t>rand_illegal_op</w:t>
       </w:r>
       <w:proofErr w:type="spellEnd"/>
       <w:r>
@@ -1482,16 +1407,7 @@
           <w:sz w:val="18"/>
           <w:szCs w:val="18"/>
         </w:rPr>
-        <w:t>[</w:t>
-      </w:r>
-      <w:proofErr w:type="gramEnd"/>
-      <w:r>
-        <w:rPr>
-          <w:rFonts w:ascii="Consolas" w:eastAsia="Consolas" w:hAnsi="Consolas" w:cs="Consolas"/>
-          <w:sz w:val="18"/>
-          <w:szCs w:val="18"/>
-        </w:rPr>
-        <w:t>2:0] == 3'd0);</w:t>
+        <w:t>[2:0] == 3'd0);</w:t>
       </w:r>
     </w:p>
     <w:p>
@@ -1661,25 +1577,7 @@
           <w:sz w:val="18"/>
           <w:szCs w:val="18"/>
         </w:rPr>
-        <w:t xml:space="preserve"> </w:t>
-      </w:r>
-      <w:proofErr w:type="gramStart"/>
-      <w:r>
-        <w:rPr>
-          <w:rFonts w:ascii="Consolas" w:eastAsia="Consolas" w:hAnsi="Consolas" w:cs="Consolas"/>
-          <w:sz w:val="18"/>
-          <w:szCs w:val="18"/>
-        </w:rPr>
-        <w:t>= !</w:t>
-      </w:r>
-      <w:proofErr w:type="gramEnd"/>
-      <w:r>
-        <w:rPr>
-          <w:rFonts w:ascii="Consolas" w:eastAsia="Consolas" w:hAnsi="Consolas" w:cs="Consolas"/>
-          <w:sz w:val="18"/>
-          <w:szCs w:val="18"/>
-        </w:rPr>
-        <w:t xml:space="preserve"> $reset &amp;&amp; ($</w:t>
+        <w:t xml:space="preserve"> = ! $reset &amp;&amp; ($</w:t>
       </w:r>
       <w:proofErr w:type="spellStart"/>
       <w:r>
@@ -1688,16 +1586,7 @@
           <w:sz w:val="18"/>
           <w:szCs w:val="18"/>
         </w:rPr>
-        <w:t>rand_over_</w:t>
-      </w:r>
-      <w:proofErr w:type="gramStart"/>
-      <w:r>
-        <w:rPr>
-          <w:rFonts w:ascii="Consolas" w:eastAsia="Consolas" w:hAnsi="Consolas" w:cs="Consolas"/>
-          <w:sz w:val="18"/>
-          <w:szCs w:val="18"/>
-        </w:rPr>
-        <w:t>flow</w:t>
+        <w:t>rand_over_flow</w:t>
       </w:r>
       <w:proofErr w:type="spellEnd"/>
       <w:r>
@@ -1706,16 +1595,7 @@
           <w:sz w:val="18"/>
           <w:szCs w:val="18"/>
         </w:rPr>
-        <w:t>[</w:t>
-      </w:r>
-      <w:proofErr w:type="gramEnd"/>
-      <w:r>
-        <w:rPr>
-          <w:rFonts w:ascii="Consolas" w:eastAsia="Consolas" w:hAnsi="Consolas" w:cs="Consolas"/>
-          <w:sz w:val="18"/>
-          <w:szCs w:val="18"/>
-        </w:rPr>
-        <w:t>2:0] == 3'd0);</w:t>
+        <w:t>[2:0] == 3'd0);</w:t>
       </w:r>
     </w:p>
     <w:p>
@@ -1895,25 +1775,7 @@
           <w:sz w:val="18"/>
           <w:szCs w:val="18"/>
         </w:rPr>
-        <w:t xml:space="preserve"> </w:t>
-      </w:r>
-      <w:proofErr w:type="gramStart"/>
-      <w:r>
-        <w:rPr>
-          <w:rFonts w:ascii="Consolas" w:eastAsia="Consolas" w:hAnsi="Consolas" w:cs="Consolas"/>
-          <w:sz w:val="18"/>
-          <w:szCs w:val="18"/>
-        </w:rPr>
-        <w:t>= !</w:t>
-      </w:r>
-      <w:proofErr w:type="gramEnd"/>
-      <w:r>
-        <w:rPr>
-          <w:rFonts w:ascii="Consolas" w:eastAsia="Consolas" w:hAnsi="Consolas" w:cs="Consolas"/>
-          <w:sz w:val="18"/>
-          <w:szCs w:val="18"/>
-        </w:rPr>
-        <w:t xml:space="preserve"> $reset &amp;&amp; ($</w:t>
+        <w:t xml:space="preserve"> = ! $reset &amp;&amp; ($</w:t>
       </w:r>
       <w:proofErr w:type="spellStart"/>
       <w:r>
@@ -1922,16 +1784,7 @@
           <w:sz w:val="18"/>
           <w:szCs w:val="18"/>
         </w:rPr>
-        <w:t>rand_div_by_</w:t>
-      </w:r>
-      <w:proofErr w:type="gramStart"/>
-      <w:r>
-        <w:rPr>
-          <w:rFonts w:ascii="Consolas" w:eastAsia="Consolas" w:hAnsi="Consolas" w:cs="Consolas"/>
-          <w:sz w:val="18"/>
-          <w:szCs w:val="18"/>
-        </w:rPr>
-        <w:t>zero</w:t>
+        <w:t>rand_div_by_zero</w:t>
       </w:r>
       <w:proofErr w:type="spellEnd"/>
       <w:r>
@@ -1940,16 +1793,7 @@
           <w:sz w:val="18"/>
           <w:szCs w:val="18"/>
         </w:rPr>
-        <w:t>[</w:t>
-      </w:r>
-      <w:proofErr w:type="gramEnd"/>
-      <w:r>
-        <w:rPr>
-          <w:rFonts w:ascii="Consolas" w:eastAsia="Consolas" w:hAnsi="Consolas" w:cs="Consolas"/>
-          <w:sz w:val="18"/>
-          <w:szCs w:val="18"/>
-        </w:rPr>
-        <w:t>2:0] == 3'd0);</w:t>
+        <w:t>[2:0] == 3'd0);</w:t>
       </w:r>
     </w:p>
     <w:p>
@@ -2754,34 +2598,16 @@
           <w:sz w:val="20"/>
           <w:szCs w:val="20"/>
         </w:rPr>
-        <w:t>rand_</w:t>
-      </w:r>
-      <w:proofErr w:type="gramStart"/>
+        <w:t>rand_x</w:t>
+      </w:r>
+      <w:proofErr w:type="spellEnd"/>
       <w:r>
         <w:rPr>
           <w:rFonts w:ascii="Consolas" w:eastAsia="Consolas" w:hAnsi="Consolas" w:cs="Consolas"/>
           <w:sz w:val="20"/>
           <w:szCs w:val="20"/>
         </w:rPr>
-        <w:t>x</w:t>
-      </w:r>
-      <w:proofErr w:type="spellEnd"/>
-      <w:r>
-        <w:rPr>
-          <w:rFonts w:ascii="Consolas" w:eastAsia="Consolas" w:hAnsi="Consolas" w:cs="Consolas"/>
-          <w:sz w:val="20"/>
-          <w:szCs w:val="20"/>
-        </w:rPr>
-        <w:t>[</w:t>
-      </w:r>
-      <w:proofErr w:type="gramEnd"/>
-      <w:r>
-        <w:rPr>
-          <w:rFonts w:ascii="Consolas" w:eastAsia="Consolas" w:hAnsi="Consolas" w:cs="Consolas"/>
-          <w:sz w:val="20"/>
-          <w:szCs w:val="20"/>
-        </w:rPr>
-        <w:t>2:0] == 3'd0</w:t>
+        <w:t>[2:0] == 3'd0</w:t>
       </w:r>
       <w:r>
         <w:t>). Errors are then common enough to see in the 40-cycle run but still leave clean cycles, so the OR behaviour is visible in the waveform.</w:t>
@@ -2804,11 +2630,7 @@
         <w:t xml:space="preserve">Reset qualification. </w:t>
       </w:r>
       <w:r>
-        <w:t xml:space="preserve">Every condition is ANDed </w:t>
-      </w:r>
-      <w:proofErr w:type="gramStart"/>
-      <w:r>
-        <w:t xml:space="preserve">with </w:t>
+        <w:t xml:space="preserve">Every condition is ANDed with </w:t>
       </w:r>
       <w:r>
         <w:rPr>
@@ -2816,16 +2638,7 @@
           <w:sz w:val="20"/>
           <w:szCs w:val="20"/>
         </w:rPr>
-        <w:t>!</w:t>
-      </w:r>
-      <w:proofErr w:type="gramEnd"/>
-      <w:r>
-        <w:rPr>
-          <w:rFonts w:ascii="Consolas" w:eastAsia="Consolas" w:hAnsi="Consolas" w:cs="Consolas"/>
-          <w:sz w:val="20"/>
-          <w:szCs w:val="20"/>
-        </w:rPr>
-        <w:t>$reset</w:t>
+        <w:t>!$reset</w:t>
       </w:r>
       <w:r>
         <w:t>, so no error is flagged while the design is being reset.</w:t>
@@ -3947,7 +3760,7 @@
       </w:r>
     </w:p>
     <w:sectPr>
-      <w:footerReference w:type="default" r:id="rId11"/>
+      <w:footerReference w:type="default" r:id="rId12"/>
       <w:pgSz w:w="11906" w:h="16838"/>
       <w:pgMar w:top="1440" w:right="1440" w:bottom="1440" w:left="1440" w:header="708" w:footer="708" w:gutter="0"/>
       <w:cols w:space="720"/>
@@ -4818,6 +4631,18 @@
       <w:szCs w:val="20"/>
     </w:rPr>
   </w:style>
+  <w:style w:type="character" w:styleId="UnresolvedMention">
+    <w:name w:val="Unresolved Mention"/>
+    <w:basedOn w:val="DefaultParagraphFont"/>
+    <w:uiPriority w:val="99"/>
+    <w:semiHidden/>
+    <w:unhideWhenUsed/>
+    <w:rsid w:val="00515AA4"/>
+    <w:rPr>
+      <w:color w:val="605E5C"/>
+      <w:shd w:val="clear" w:color="auto" w:fill="E1DFDD"/>
+    </w:rPr>
+  </w:style>
 </w:styles>
 </file>
 

</xml_diff>